<commit_message>
completed build ui and untrack environment secrets
</commit_message>
<xml_diff>
--- a/test_resume.docx
+++ b/test_resume.docx
@@ -3,71 +3,10 @@
 <w:document xmlns:wpc="http://schemas.microsoft.com/office/word/2010/wordprocessingCanvas" xmlns:mo="http://schemas.microsoft.com/office/mac/office/2008/main" xmlns:mc="http://schemas.openxmlformats.org/markup-compatibility/2006" xmlns:mv="urn:schemas-microsoft-com:mac:vml" xmlns:o="urn:schemas-microsoft-com:office:office" xmlns:r="http://schemas.openxmlformats.org/officeDocument/2006/relationships" xmlns:m="http://schemas.openxmlformats.org/officeDocument/2006/math" xmlns:v="urn:schemas-microsoft-com:vml" xmlns:wp14="http://schemas.microsoft.com/office/word/2010/wordprocessingDrawing" xmlns:wp="http://schemas.openxmlformats.org/drawingml/2006/wordprocessingDrawing" xmlns:w10="urn:schemas-microsoft-com:office:word" xmlns:w="http://schemas.openxmlformats.org/wordprocessingml/2006/main" xmlns:w14="http://schemas.microsoft.com/office/word/2010/wordml" xmlns:wpg="http://schemas.microsoft.com/office/word/2010/wordprocessingGroup" xmlns:wpi="http://schemas.microsoft.com/office/word/2010/wordprocessingInk" xmlns:wne="http://schemas.microsoft.com/office/word/2006/wordml" xmlns:wps="http://schemas.microsoft.com/office/word/2010/wordprocessingShape" mc:Ignorable="w14 wp14">
   <w:body>
     <w:p>
-      <w:pPr>
-        <w:pStyle w:val="Title"/>
-      </w:pPr>
       <w:r>
-        <w:t>Jane Doe - Resume</w:t>
+        <w:t>Jane Doe Resume</w:t>
       </w:r>
     </w:p>
-    <w:p>
-      <w:r>
-        <w:t>Email: jane.doe@example.com | Phone: (123) 456-7890</w:t>
-      </w:r>
-    </w:p>
-    <w:p>
-      <w:pPr>
-        <w:pStyle w:val="Heading1"/>
-      </w:pPr>
-      <w:r>
-        <w:t>Summary</w:t>
-      </w:r>
-    </w:p>
-    <w:p>
-      <w:r>
-        <w:t>Experienced software engineer specializing in Python development and technical writing.</w:t>
-      </w:r>
-    </w:p>
-    <w:p>
-      <w:pPr>
-        <w:pStyle w:val="Heading1"/>
-      </w:pPr>
-      <w:r>
-        <w:t>Skills</w:t>
-      </w:r>
-    </w:p>
-    <w:tbl>
-      <w:tblPr>
-        <w:tblW w:type="auto" w:w="0"/>
-        <w:tblLook w:firstColumn="1" w:firstRow="1" w:lastColumn="0" w:lastRow="0" w:noHBand="0" w:noVBand="1" w:val="04A0"/>
-      </w:tblPr>
-      <w:tblGrid>
-        <w:gridCol w:w="4320"/>
-        <w:gridCol w:w="4320"/>
-      </w:tblGrid>
-      <w:tr>
-        <w:tc>
-          <w:tcPr>
-            <w:tcW w:type="dxa" w:w="4320"/>
-          </w:tcPr>
-          <w:p>
-            <w:r>
-              <w:t>Languages</w:t>
-            </w:r>
-          </w:p>
-        </w:tc>
-        <w:tc>
-          <w:tcPr>
-            <w:tcW w:type="dxa" w:w="4320"/>
-          </w:tcPr>
-          <w:p>
-            <w:r>
-              <w:t>Python, HTML, CSS, JavaScript</w:t>
-            </w:r>
-          </w:p>
-        </w:tc>
-      </w:tr>
-    </w:tbl>
     <w:sectPr>
       <w:pgSz w:w="12240" w:h="15840"/>
       <w:pgMar w:top="1440" w:right="1800" w:bottom="1440" w:left="1800" w:header="720" w:footer="720" w:gutter="0"/>

</xml_diff>